<commit_message>
Retirar teléfono personal de A3 para G1
</commit_message>
<xml_diff>
--- a/08_Etica/A3_Consentimiento_Informado_Terapia_Fisica.docx
+++ b/08_Etica/A3_Consentimiento_Informado_Terapia_Fisica.docx
@@ -527,7 +527,7 @@
           <w:sz w:val="23"/>
           <w:u w:val="none"/>
         </w:rPr>
-        <w:t>Para dudas sobre el proyecto puede comunicarse con el docente responsable al correo gguerrero@uteq.edu.ec o con el líder del equipo, Angelo Paul Zambrano Moya, al teléfono +593 99 703 9844 y correo azambranom18@uteq.edu.ec.</w:t>
+        <w:t>Para dudas sobre el proyecto puede comunicarse con el docente responsable al correo gguerrero@uteq.edu.ec o con el líder del equipo, Angelo Paul Zambrano Moya, al correo azambranom18@uteq.edu.ec.</w:t>
       </w:r>
     </w:p>
     <w:p>
@@ -1452,7 +1452,7 @@
           <w:sz w:val="23"/>
           <w:u w:val="none"/>
         </w:rPr>
-        <w:t>Para dudas sobre el proyecto puede comunicarse con el docente responsable al correo gguerrero@uteq.edu.ec o con el líder del equipo, Angelo Paul Zambrano Moya, al teléfono +593 99 703 9844 y correo azambranom18@uteq.edu.ec.</w:t>
+        <w:t>Para dudas sobre el proyecto puede comunicarse con el docente responsable al correo gguerrero@uteq.edu.ec o con el líder del equipo, Angelo Paul Zambrano Moya, al correo azambranom18@uteq.edu.ec.</w:t>
       </w:r>
     </w:p>
     <w:p>
@@ -2377,7 +2377,7 @@
           <w:sz w:val="23"/>
           <w:u w:val="none"/>
         </w:rPr>
-        <w:t>Para dudas sobre el proyecto puede comunicarse con el docente responsable al correo gguerrero@uteq.edu.ec o con el líder del equipo, Angelo Paul Zambrano Moya, al teléfono +593 99 703 9844 y correo azambranom18@uteq.edu.ec.</w:t>
+        <w:t>Para dudas sobre el proyecto puede comunicarse con el docente responsable al correo gguerrero@uteq.edu.ec o con el líder del equipo, Angelo Paul Zambrano Moya, al correo azambranom18@uteq.edu.ec.</w:t>
       </w:r>
     </w:p>
     <w:p>
@@ -3302,7 +3302,7 @@
           <w:sz w:val="23"/>
           <w:u w:val="none"/>
         </w:rPr>
-        <w:t>Para dudas sobre el proyecto puede comunicarse con el docente responsable al correo gguerrero@uteq.edu.ec o con el líder del equipo, Angelo Paul Zambrano Moya, al teléfono +593 99 703 9844 y correo azambranom18@uteq.edu.ec.</w:t>
+        <w:t>Para dudas sobre el proyecto puede comunicarse con el docente responsable al correo gguerrero@uteq.edu.ec o con el líder del equipo, Angelo Paul Zambrano Moya, al correo azambranom18@uteq.edu.ec.</w:t>
       </w:r>
     </w:p>
     <w:p>
@@ -4227,7 +4227,7 @@
           <w:sz w:val="23"/>
           <w:u w:val="none"/>
         </w:rPr>
-        <w:t>Para dudas sobre el proyecto puede comunicarse con el docente responsable al correo gguerrero@uteq.edu.ec o con el líder del equipo, Angelo Paul Zambrano Moya, al teléfono +593 99 703 9844 y correo azambranom18@uteq.edu.ec.</w:t>
+        <w:t>Para dudas sobre el proyecto puede comunicarse con el docente responsable al correo gguerrero@uteq.edu.ec o con el líder del equipo, Angelo Paul Zambrano Moya, al correo azambranom18@uteq.edu.ec.</w:t>
       </w:r>
     </w:p>
     <w:p>
@@ -5152,7 +5152,7 @@
           <w:sz w:val="23"/>
           <w:u w:val="none"/>
         </w:rPr>
-        <w:t>Para dudas sobre el proyecto puede comunicarse con el docente responsable al correo gguerrero@uteq.edu.ec o con el líder del equipo, Angelo Paul Zambrano Moya, al teléfono +593 99 703 9844 y correo azambranom18@uteq.edu.ec.</w:t>
+        <w:t>Para dudas sobre el proyecto puede comunicarse con el docente responsable al correo gguerrero@uteq.edu.ec o con el líder del equipo, Angelo Paul Zambrano Moya, al correo azambranom18@uteq.edu.ec.</w:t>
       </w:r>
     </w:p>
     <w:p>
@@ -6077,7 +6077,7 @@
           <w:sz w:val="23"/>
           <w:u w:val="none"/>
         </w:rPr>
-        <w:t>Para dudas sobre el proyecto puede comunicarse con el docente responsable al correo gguerrero@uteq.edu.ec o con el líder del equipo, Angelo Paul Zambrano Moya, al teléfono +593 99 703 9844 y correo azambranom18@uteq.edu.ec.</w:t>
+        <w:t>Para dudas sobre el proyecto puede comunicarse con el docente responsable al correo gguerrero@uteq.edu.ec o con el líder del equipo, Angelo Paul Zambrano Moya, al correo azambranom18@uteq.edu.ec.</w:t>
       </w:r>
     </w:p>
     <w:p>

</xml_diff>